<commit_message>
Fix figure text overlaps; whitepaper writing review pass
- figures 2/3/5/6: collided or overflowing labels shortened and
  repositioned (verified by rendering every SVG and inspecting output)
- WHITEPAPER.md review: dangling agent in 4.1, 'Plus:' fragment in 4.4
  replaced with a sentence, related-work wall split into three paragraphs
- PDF / DOCX / standalone HTML regenerated
</commit_message>
<xml_diff>
--- a/docs/TrueLend-Whitepaper.docx
+++ b/docs/TrueLend-Whitepaper.docx
@@ -1395,23 +1395,7 @@
         <w:pStyle w:val="FirstParagraph"/>
       </w:pPr>
       <w:r>
-        <w:t xml:space="preserve">A</w:t>
-      </w:r>
-      <w:r>
-        <w:t xml:space="preserve"> </w:t>
-      </w:r>
-      <w:r>
-        <w:rPr>
-          <w:b/>
-          <w:bCs/>
-        </w:rPr>
-        <w:t xml:space="preserve">position</w:t>
-      </w:r>
-      <w:r>
-        <w:t xml:space="preserve"> </w:t>
-      </w:r>
-      <w:r>
-        <w:t xml:space="preserve">deposits collateral in one pool currency and borrows the other from that side's lender vault. The borrower selects a</w:t>
+        <w:t xml:space="preserve">A position is opened by depositing collateral in one pool currency and borrowing the other from that side's lender vault. The borrower selects a</w:t>
       </w:r>
       <w:r>
         <w:t xml:space="preserve"> </w:t>
@@ -1667,7 +1651,7 @@
                     <a:graphicData uri="http://schemas.openxmlformats.org/drawingml/2006/picture">
                       <pic:pic>
                         <pic:nvPicPr>
-                          <pic:cNvPr descr="data:image/svg+xml;base64,PHN2ZyB2aWV3Ym94PSIwIDAgNjgwIDIxMCIgcm9sZT0iaW1nIiBhcmlhLWxhYmVsPSJBIHBvc2l0aW9uJiMzOTtzIGFuYXRvbXkgb24gdGhlIHByaWNlIGF4aXMsIHVzaW5nIHRoZSB3b3JrZWQgZXhhbXBsZSI+CiAgICA8ZGVmcz4KICAgICAgPG1hcmtlciBpZD0iYXJyUjIiIHZpZXdib3g9IjAgMCA4IDgiIHJlZng9IjciIHJlZnk9IjQiIG1hcmtlcndpZHRoPSI3IiBtYXJrZXJoZWlnaHQ9IjciIG9yaWVudD0iYXV0byI+PHBvbHlnb24gcG9pbnRzPSIwLDAuNSA4LDQgMCw3LjUiIGZpbGw9InZhcigtLXJpc2spIj48L3BvbHlnb24+PC9tYXJrZXI+CiAgICA8L2RlZnM+CiAgICA8IS0tIGF4aXMgLS0+CiAgICA8bGluZSB4MT0iMzAiIHkxPSIxMzAiIHgyPSI2NTAiIHkyPSIxMzAiIHN0cm9rZT0idmFyKC0taW5rKSIgc3Ryb2tlLXdpZHRoPSIxLjYiPjwvbGluZT4KICAgIDx0ZXh0IHg9IjY1MCIgeT0iMTE4IiB0ZXh0LWFuY2hvcj0iZW5kIiBmb250LXNpemU9IjExIiBmaWxsPSJ2YXIoLS1tdXRlZCkiPkVUSCBwcmljZSDihpI8L3RleHQ+CgogICAgPCEtLSBiYW5kcyAtLT4KICAgIDxyZWN0IHg9IjEyMCIgeT0iMTA2IiB3aWR0aD0iMjAwIiBoZWlnaHQ9IjQ4IiBmaWxsPSJ2YXIoLS1iYW5kKSIgLz4KICAgIDxyZWN0IHg9IjMwIiB5PSIxMDYiIHdpZHRoPSI5MCIgaGVpZ2h0PSI0OCIgZmlsbD0idmFyKC0tYmFuZC1zdHJvbmcpIiAvPgogICAgPHJlY3QgeD0iMzIwIiB5PSIxMDYiIHdpZHRoPSIzMzAiIGhlaWdodD0iNDgiIGZpbGw9InZhcigtLXNhZmViYW5kKSIgLz4KCiAgICA8IS0tIG1hcmtlcnMgLS0+CiAgICA8bGluZSB4MT0iMTIwIiB5MT0iOTYiIHgyPSIxMjAiIHkyPSIxNjQiIHN0cm9rZT0idmFyKC0tcmlzaykiIHN0cm9rZS13aWR0aD0iMS40IiBzdHJva2UtZGFzaGFycmF5PSI0IDMiPjwvbGluZT4KICAgIDxsaW5lIHgxPSIzMjAiIHkxPSI5MiIgeDI9IjMyMCIgeTI9IjE2OCIgc3Ryb2tlPSJ2YXIoLS1yaXNrKSIgc3Ryb2tlLXdpZHRoPSIyIj48L2xpbmU+CiAgICA8Y2lyY2xlIGN4PSI1NjAiIGN5PSIxMzAiIHI9IjYiIGZpbGw9InZhcigtLWFjY2VudCkiPjwvY2lyY2xlPgogICAgPGxpbmUgeDE9IjQzMCIgeTE9IjExMiIgeDI9IjQzMCIgeTI9IjE0OCIgc3Ryb2tlPSJ2YXIoLS1tdXRlZCkiIHN0cm9rZS13aWR0aD0iMS4yIiBzdHJva2UtZGFzaGFycmF5PSIyIDMiPjwvbGluZT4KCiAgICA8IS0tIGxhYmVscyBhYm92ZSAtLT4KICAgIDx0ZXh0IHg9IjU2MCIgeT0iNzgiIHRleHQtYW5jaG9yPSJtaWRkbGUiIGZvbnQtc2l6ZT0iMTEuNSIgZm9udC13ZWlnaHQ9IjcwMCIgZmlsbD0idmFyKC0tYWNjZW50KSI+c3BvdCAkMiw1MDA8L3RleHQ+CiAgICA8dGV4dCB4PSI1NjAiIHk9IjkzIiB0ZXh0LWFuY2hvcj0ibWlkZGxlIiBmb250LXNpemU9IjEwIiBmaWxsPSJ2YXIoLS1tdXRlZCkiPm9wZW46IDEgRVRIIGNvbGwgwrcgMSw4MDAgVVNEQyBkZWJ0PC90ZXh0PgogICAgPHRleHQgeD0iMzIwIiB5PSI2NiIgdGV4dC1hbmNob3I9Im1pZGRsZSIgZm9udC1zaXplPSIxMS41IiBmb250LXdlaWdodD0iNzAwIiBmaWxsPSJ2YXIoLS1yaXNrKSI+cmFuZ2Ugc3RhcnQgJDIsMDAwPC90ZXh0PgogICAgPHRleHQgeD0iMzIwIiB5PSI4MSIgdGV4dC1hbmNob3I9Im1pZGRsZSIgZm9udC1zaXplPSIxMCIgZmlsbD0idmFyKC0tbXV0ZWQpIj5kZWJ0ID0gTFQgw5cgY29sbGF0ZXJhbCB2YWx1ZTwvdGV4dD4KICAgIDx0ZXh0IHg9IjEyMCIgeT0iNzgiIHRleHQtYW5jaG9yPSJtaWRkbGUiIGZvbnQtc2l6ZT0iMTEuNSIgZm9udC13ZWlnaHQ9IjcwMCIgZmlsbD0idmFyKC0tcmlzaykiPnJhbmdlIGVuZCAkMSw0MTQ8L3RleHQ+CiAgICA8dGV4dCB4PSIxMjAiIHk9IjkzIiB0ZXh0LWFuY2hvcj0ibWlkZGxlIiBmb250LXNpemU9IjEwIiBmaWxsPSJ2YXIoLS1tdXRlZCkiPmJhbmtydXB0Y3kgbGluZSAow7fiiJoyKTwvdGV4dD4KICAgIDx0ZXh0IHg9IjQzMCIgeT0iMTA0IiB0ZXh0LWFuY2hvcj0ibWlkZGxlIiBmb250LXNpemU9IjEwIiBmaWxsPSJ2YXIoLS1tdXRlZCkiPkxUViA3MiUgwrcgTFQgOTAlPC90ZXh0PgoKICAgIDwhLS0gbGFiZWxzIGJlbG93IC0tPgogICAgPHRleHQgeD0iMjIwIiB5PSIxODIiIHRleHQtYW5jaG9yPSJtaWRkbGUiIGZvbnQtc2l6ZT0iMTAuNSIgZmlsbD0idmFyKC0tcmlzaykiPkNIVU5LRUQgREVDQVkgd2hpbGUgdGljayBpcyBpbnNpZGU8L3RleHQ+CiAgICA8dGV4dCB4PSI3NSIgeT0iMTgyIiB0ZXh0LWFuY2hvcj0ibWlkZGxlIiBmb250LXNpemU9IjEwLjUiIGZpbGw9InZhcigtLXJpc2spIj5mb3JjZUNsb3NlIHpvbmU8L3RleHQ+CiAgICA8dGV4dCB4PSI0ODUiIHk9IjE4MiIgdGV4dC1hbmNob3I9Im1pZGRsZSIgZm9udC1zaXplPSIxMC41IiBmaWxsPSJ2YXIoLS1zYWZlKSI+bm8gcGVyLXN3YXAgd29yayBhdCBhbGw8L3RleHQ+CgogICAgPCEtLSBkZWNheSBhcnJvd3MgaW5zaWRlIHRoZSBiYW5kIC0tPgogICAgPGxpbmUgeDE9IjMwMCIgeTE9IjE0MCIgeDI9IjI2NCIgeTI9IjE0MCIgc3Ryb2tlPSJ2YXIoLS1yaXNrKSIgc3Ryb2tlLXdpZHRoPSIxLjQiIG1hcmtlci1lbmQ9InVybCgjYXJyUjIpIj48L2xpbmU+CiAgICA8bGluZSB4MT0iMjUyIiB5MT0iMTQwIiB4Mj0iMjE2IiB5Mj0iMTQwIiBzdHJva2U9InZhcigtLXJpc2spIiBzdHJva2Utd2lkdGg9IjEuNCIgbWFya2VyLWVuZD0idXJsKCNhcnJSMikiPjwvbGluZT4KICAgIDxsaW5lIHgxPSIyMDQiIHkxPSIxNDAiIHgyPSIxNjgiIHkyPSIxNDAiIHN0cm9rZT0idmFyKC0tcmlzaykiIHN0cm9rZS13aWR0aD0iMS40IiBtYXJrZXItZW5kPSJ1cmwoI2FyclIyKSI+PC9saW5lPgogIDwvc3ZnPg==" id="25" name="Picture"/>
+                          <pic:cNvPr descr="data:image/svg+xml;base64,PHN2ZyB2aWV3Ym94PSIwIDAgNjgwIDIxMCIgcm9sZT0iaW1nIiBhcmlhLWxhYmVsPSJBIHBvc2l0aW9uJiMzOTtzIGFuYXRvbXkgb24gdGhlIHByaWNlIGF4aXMsIHVzaW5nIHRoZSB3b3JrZWQgZXhhbXBsZSI+CiAgICA8ZGVmcz4KICAgICAgPG1hcmtlciBpZD0iYXJyUjIiIHZpZXdib3g9IjAgMCA4IDgiIHJlZng9IjciIHJlZnk9IjQiIG1hcmtlcndpZHRoPSI3IiBtYXJrZXJoZWlnaHQ9IjciIG9yaWVudD0iYXV0byI+PHBvbHlnb24gcG9pbnRzPSIwLDAuNSA4LDQgMCw3LjUiIGZpbGw9InZhcigtLXJpc2spIj48L3BvbHlnb24+PC9tYXJrZXI+CiAgICA8L2RlZnM+CiAgICA8IS0tIGF4aXMgLS0+CiAgICA8bGluZSB4MT0iMzAiIHkxPSIxMzAiIHgyPSI2NTAiIHkyPSIxMzAiIHN0cm9rZT0idmFyKC0taW5rKSIgc3Ryb2tlLXdpZHRoPSIxLjYiPjwvbGluZT4KICAgIDx0ZXh0IHg9IjY1MCIgeT0iMTE4IiB0ZXh0LWFuY2hvcj0iZW5kIiBmb250LXNpemU9IjExIiBmaWxsPSJ2YXIoLS1tdXRlZCkiPkVUSCBwcmljZSDihpI8L3RleHQ+CgogICAgPCEtLSBiYW5kcyAtLT4KICAgIDxyZWN0IHg9IjEyMCIgeT0iMTA2IiB3aWR0aD0iMjAwIiBoZWlnaHQ9IjQ4IiBmaWxsPSJ2YXIoLS1iYW5kKSIgLz4KICAgIDxyZWN0IHg9IjMwIiB5PSIxMDYiIHdpZHRoPSI5MCIgaGVpZ2h0PSI0OCIgZmlsbD0idmFyKC0tYmFuZC1zdHJvbmcpIiAvPgogICAgPHJlY3QgeD0iMzIwIiB5PSIxMDYiIHdpZHRoPSIzMzAiIGhlaWdodD0iNDgiIGZpbGw9InZhcigtLXNhZmViYW5kKSIgLz4KCiAgICA8IS0tIG1hcmtlcnMgLS0+CiAgICA8bGluZSB4MT0iMTIwIiB5MT0iOTYiIHgyPSIxMjAiIHkyPSIxNjQiIHN0cm9rZT0idmFyKC0tcmlzaykiIHN0cm9rZS13aWR0aD0iMS40IiBzdHJva2UtZGFzaGFycmF5PSI0IDMiPjwvbGluZT4KICAgIDxsaW5lIHgxPSIzMjAiIHkxPSI5MiIgeDI9IjMyMCIgeTI9IjE2OCIgc3Ryb2tlPSJ2YXIoLS1yaXNrKSIgc3Ryb2tlLXdpZHRoPSIyIj48L2xpbmU+CiAgICA8Y2lyY2xlIGN4PSI1NjAiIGN5PSIxMzAiIHI9IjYiIGZpbGw9InZhcigtLWFjY2VudCkiPjwvY2lyY2xlPgogICAgPGxpbmUgeDE9IjQzMCIgeTE9IjExMiIgeDI9IjQzMCIgeTI9IjE0OCIgc3Ryb2tlPSJ2YXIoLS1tdXRlZCkiIHN0cm9rZS13aWR0aD0iMS4yIiBzdHJva2UtZGFzaGFycmF5PSIyIDMiPjwvbGluZT4KCiAgICA8IS0tIGxhYmVscyBhYm92ZSAtLT4KICAgIDx0ZXh0IHg9IjU2MCIgeT0iNzgiIHRleHQtYW5jaG9yPSJtaWRkbGUiIGZvbnQtc2l6ZT0iMTEuNSIgZm9udC13ZWlnaHQ9IjcwMCIgZmlsbD0idmFyKC0tYWNjZW50KSI+c3BvdCAkMiw1MDA8L3RleHQ+CiAgICA8dGV4dCB4PSI1NjAiIHk9IjkzIiB0ZXh0LWFuY2hvcj0ibWlkZGxlIiBmb250LXNpemU9IjEwIiBmaWxsPSJ2YXIoLS1tdXRlZCkiPm9wZW46IDEgRVRIIGNvbGwgwrcgMSw4MDAgVVNEQyBkZWJ0PC90ZXh0PgogICAgPHRleHQgeD0iMzIwIiB5PSI2NiIgdGV4dC1hbmNob3I9Im1pZGRsZSIgZm9udC1zaXplPSIxMS41IiBmb250LXdlaWdodD0iNzAwIiBmaWxsPSJ2YXIoLS1yaXNrKSI+cmFuZ2Ugc3RhcnQgJDIsMDAwPC90ZXh0PgogICAgPHRleHQgeD0iMzIwIiB5PSI4MSIgdGV4dC1hbmNob3I9Im1pZGRsZSIgZm9udC1zaXplPSIxMCIgZmlsbD0idmFyKC0tbXV0ZWQpIj5kZWJ0ID0gTFQgw5cgY29sbGF0ZXJhbCB2YWx1ZTwvdGV4dD4KICAgIDx0ZXh0IHg9IjEyMCIgeT0iNzgiIHRleHQtYW5jaG9yPSJtaWRkbGUiIGZvbnQtc2l6ZT0iMTEuNSIgZm9udC13ZWlnaHQ9IjcwMCIgZmlsbD0idmFyKC0tcmlzaykiPnJhbmdlIGVuZCAkMSw0MTQ8L3RleHQ+CiAgICA8dGV4dCB4PSIxMjAiIHk9IjkzIiB0ZXh0LWFuY2hvcj0ibWlkZGxlIiBmb250LXNpemU9IjEwIiBmaWxsPSJ2YXIoLS1tdXRlZCkiPmJhbmtydXB0Y3kgbGluZSAow7fiiJoyKTwvdGV4dD4KICAgIDx0ZXh0IHg9IjQzMCIgeT0iMTA0IiB0ZXh0LWFuY2hvcj0ibWlkZGxlIiBmb250LXNpemU9IjEwIiBmaWxsPSJ2YXIoLS1tdXRlZCkiPkxUViA3MiUgwrcgTFQgOTAlPC90ZXh0PgoKICAgIDwhLS0gbGFiZWxzIGJlbG93IC0tPgogICAgPHRleHQgeD0iMjQwIiB5PSIxODIiIHRleHQtYW5jaG9yPSJtaWRkbGUiIGZvbnQtc2l6ZT0iMTAuNSIgZmlsbD0idmFyKC0tcmlzaykiPmNodW5rZWQgZGVjYXkgd2hpbGUgaW5zaWRlPC90ZXh0PgogICAgPHRleHQgeD0iNzAiIHk9IjE4MiIgdGV4dC1hbmNob3I9Im1pZGRsZSIgZm9udC1zaXplPSIxMC41IiBmaWxsPSJ2YXIoLS1yaXNrKSI+Zm9yY2VDbG9zZTwvdGV4dD4KICAgIDx0ZXh0IHg9IjQ5NSIgeT0iMTgyIiB0ZXh0LWFuY2hvcj0ibWlkZGxlIiBmb250LXNpemU9IjEwLjUiIGZpbGw9InZhcigtLXNhZmUpIj5ubyBwZXItc3dhcCB3b3JrPC90ZXh0PgoKICAgIDwhLS0gZGVjYXkgYXJyb3dzIGluc2lkZSB0aGUgYmFuZCAtLT4KICAgIDxsaW5lIHgxPSIzMDAiIHkxPSIxNDAiIHgyPSIyNjQiIHkyPSIxNDAiIHN0cm9rZT0idmFyKC0tcmlzaykiIHN0cm9rZS13aWR0aD0iMS40IiBtYXJrZXItZW5kPSJ1cmwoI2FyclIyKSI+PC9saW5lPgogICAgPGxpbmUgeDE9IjI1MiIgeTE9IjE0MCIgeDI9IjIxNiIgeTI9IjE0MCIgc3Ryb2tlPSJ2YXIoLS1yaXNrKSIgc3Ryb2tlLXdpZHRoPSIxLjQiIG1hcmtlci1lbmQ9InVybCgjYXJyUjIpIj48L2xpbmU+CiAgICA8bGluZSB4MT0iMjA0IiB5MT0iMTQwIiB4Mj0iMTY4IiB5Mj0iMTQwIiBzdHJva2U9InZhcigtLXJpc2spIiBzdHJva2Utd2lkdGg9IjEuNCIgbWFya2VyLWVuZD0idXJsKCNhcnJSMikiPjwvbGluZT4KICA8L3N2Zz4=" id="25" name="Picture"/>
                           <pic:cNvPicPr>
                             <a:picLocks noChangeArrowheads="1" noChangeAspect="1"/>
                           </pic:cNvPicPr>
@@ -1964,7 +1948,7 @@
                     <a:graphicData uri="http://schemas.openxmlformats.org/drawingml/2006/picture">
                       <pic:pic>
                         <pic:nvPicPr>
-                          <pic:cNvPr descr="data:image/svg+xml;base64,PHN2ZyB2aWV3Ym94PSIwIDAgNjgwIDI1MCIgcm9sZT0iaW1nIiBhcmlhLWxhYmVsPSJDb2xsYXRlcmFsIHJlbWFpbmluZyB2ZXJzdXMgdGltZTogZGVjYXkgd2hpbGUgaW4gcmFuZ2UsIHBhdXNlIG9uIHJlY292ZXJ5LCByZXN1bWUgb24gcmUtZW50cnkiPgogICAgPCEtLSBheGVzIC0tPgogICAgPGxpbmUgeDE9IjU2IiB5MT0iMjAiIHgyPSI1NiIgeTI9IjIwNCIgc3Ryb2tlPSJ2YXIoLS1pbmspIiBzdHJva2Utd2lkdGg9IjEuNCI+PC9saW5lPgogICAgPGxpbmUgeDE9IjU2IiB5MT0iMjA0IiB4Mj0iNjUwIiB5Mj0iMjA0IiBzdHJva2U9InZhcigtLWluaykiIHN0cm9rZS13aWR0aD0iMS40Ij48L2xpbmU+CiAgICA8dGV4dCB4PSIyMCIgeT0iMzAiIGZvbnQtc2l6ZT0iMTAiIGZpbGw9InZhcigtLW11dGVkKSI+MTAwJTwvdGV4dD4KICAgIDx0ZXh0IHg9IjI2IiB5PSIxMjIiIGZvbnQtc2l6ZT0iMTAiIGZpbGw9InZhcigtLW11dGVkKSI+NTAlPC90ZXh0PgogICAgPHRleHQgeD0iNjQwIiB5PSIyMjIiIHRleHQtYW5jaG9yPSJlbmQiIGZvbnQtc2l6ZT0iMTAuNSIgZmlsbD0idmFyKC0tbXV0ZWQpIj50aW1lIOKGkjwvdGV4dD4KICAgIDx0ZXh0IHg9IjE0IiB5PSIxNiIgZm9udC1zaXplPSIxMC41IiBmaWxsPSJ2YXIoLS1tdXRlZCkiPmNvbGxhdGVyYWwgcmVtYWluaW5nPC90ZXh0PgoKICAgIDwhLS0gaW4tcmFuZ2Ugc2hhZGluZyBzdHJpcHMgLS0+CiAgICA8cmVjdCB4PSIxMzAiIHk9IjIwIiB3aWR0aD0iMTcwIiBoZWlnaHQ9IjE4NCIgZmlsbD0idmFyKC0tYmFuZCkiIC8+CiAgICA8cmVjdCB4PSI0MjAiIHk9IjIwIiB3aWR0aD0iMTUwIiBoZWlnaHQ9IjE4NCIgZmlsbD0idmFyKC0tYmFuZCkiIC8+CiAgICA8dGV4dCB4PSIyMTUiIHk9IjM2IiB0ZXh0LWFuY2hvcj0ibWlkZGxlIiBmb250LXNpemU9IjEwIiBmaWxsPSJ2YXIoLS1yaXNrKSI+aW4gcmFuZ2U8L3RleHQ+CiAgICA8dGV4dCB4PSI0OTUiIHk9IjM2IiB0ZXh0LWFuY2hvcj0ibWlkZGxlIiBmb250LXNpemU9IjEwIiBmaWxsPSJ2YXIoLS1yaXNrKSI+aW4gcmFuZ2U8L3RleHQ+CiAgICA8dGV4dCB4PSIzNjAiIHk9IjM2IiB0ZXh0LWFuY2hvcj0ibWlkZGxlIiBmb250LXNpemU9IjEwIiBmaWxsPSJ2YXIoLS1zYWZlKSI+cmVjb3ZlcmVkPC90ZXh0PgoKICAgIDwhLS0gY29sbGF0ZXJhbCBzdGFpcmNhc2U6IGZsYXQgNTYtMTMwLCBzdGVwcyBkb3duIDEzMC0zMDAsIGZsYXQgMzAwLTQyMCwgc3RlcHMgNDIwLTU3MCwgZmxhdCAtLT4KICAgIDxwb2x5bGluZSBmaWxsPSJub25lIiBzdHJva2U9InZhcigtLWFjY2VudCkiIHN0cm9rZS13aWR0aD0iMi40IiBwb2ludHM9IjU2LDQ0IDEzMCw0NCAxMzAsNTIgMTU2LDUyIDE1Niw2MiAxODIsNjIgMTgyLDc0IDIwOCw3NCAyMDgsODcgMjM0LDg3IDIzNCw5OSAyNjAsOTkgMjYwLDExMCAyODYsMTEwIDI4NiwxMTkgMzAwLDExOQogICAgICAgICAgICAgIDQyMCwxMTkgNDIwLDEyOCA0NDYsMTI4IDQ0NiwxMzggNDcyLDEzOCA0NzIsMTQ5IDQ5OCwxNDkgNDk4LDE1OSA1MjQsMTU5IDUyNCwxNjggNTUwLDE2OCA1NTAsMTc1IDU3MCwxNzUgNjUwLDE3NSI+PC9wb2x5bGluZT4KICAgIDwhLS0gZGVidCBsaW5lOiBtaXJyb3JzIGRvd253YXJkIG1vcmUgc2xvd2x5IC0tPgogICAgPHBvbHlsaW5lIGZpbGw9Im5vbmUiIHN0cm9rZT0idmFyKC0tc2FmZSkiIHN0cm9rZS13aWR0aD0iMS44IiBzdHJva2UtZGFzaGFycmF5PSI1IDQiIHBvaW50cz0iNTYsMTUwIDEzMCwxNTAgMzAwLDE2OCA0MjAsMTY4IDU3MCwxODYgNjUwLDE4NiI+PC9wb2x5bGluZT4KICAgIDx0ZXh0IHg9IjYxMiIgeT0iMTcwIiBmb250LXNpemU9IjEwIiBmaWxsPSJ2YXIoLS1hY2NlbnQpIj5jb2xsYXRlcmFsPC90ZXh0PgogICAgPHRleHQgeD0iNjEyIiB5PSIxOTciIGZvbnQtc2l6ZT0iMTAiIGZpbGw9InZhcigtLXNhZmUpIj5kZWJ0PC90ZXh0PgoKICAgIDwhLS0gYW5ub3RhdGlvbnMgLS0+CiAgICA8dGV4dCB4PSIyMTUiIHk9IjIzOCIgdGV4dC1hbmNob3I9Im1pZGRsZSIgZm9udC1zaXplPSIxMC41IiBmaWxsPSJ2YXIoLS1tdXRlZCkiPn4xJS9taW4gc3RlcHMsIGRlcHRoLXNjYWxlZDwvdGV4dD4KICAgIDx0ZXh0IHg9IjM2MCIgeT0iMjM4IiB0ZXh0LWFuY2hvcj0ibWlkZGxlIiBmb250LXNpemU9IjEwLjUiIGZpbGw9InZhcigtLW11dGVkKSI+cGF1c2Ug4oCUIG5vdGhpbmcgY29uZmlzY2F0ZWQ8L3RleHQ+CiAgICA8dGV4dCB4PSI0OTUiIHk9IjIzOCIgdGV4dC1hbmNob3I9Im1pZGRsZSIgZm9udC1zaXplPSIxMC41IiBmaWxsPSJ2YXIoLS1tdXRlZCkiPnJlc3VtZTsgcGVuYWx0aWVzIHNjYWxlIHdpdGggdGltZS1pbi1yYW5nZTwvdGV4dD4KICA8L3N2Zz4=" id="29" name="Picture"/>
+                          <pic:cNvPr descr="data:image/svg+xml;base64,PHN2ZyB2aWV3Ym94PSIwIDAgNjgwIDI1MCIgcm9sZT0iaW1nIiBhcmlhLWxhYmVsPSJDb2xsYXRlcmFsIHJlbWFpbmluZyB2ZXJzdXMgdGltZTogZGVjYXkgd2hpbGUgaW4gcmFuZ2UsIHBhdXNlIG9uIHJlY292ZXJ5LCByZXN1bWUgb24gcmUtZW50cnkiPgogICAgPCEtLSBheGVzIC0tPgogICAgPGxpbmUgeDE9IjU2IiB5MT0iMjAiIHgyPSI1NiIgeTI9IjIwNCIgc3Ryb2tlPSJ2YXIoLS1pbmspIiBzdHJva2Utd2lkdGg9IjEuNCI+PC9saW5lPgogICAgPGxpbmUgeDE9IjU2IiB5MT0iMjA0IiB4Mj0iNjUwIiB5Mj0iMjA0IiBzdHJva2U9InZhcigtLWluaykiIHN0cm9rZS13aWR0aD0iMS40Ij48L2xpbmU+CiAgICA8dGV4dCB4PSIyMCIgeT0iMzAiIGZvbnQtc2l6ZT0iMTAiIGZpbGw9InZhcigtLW11dGVkKSI+MTAwJTwvdGV4dD4KICAgIDx0ZXh0IHg9IjI2IiB5PSIxMjIiIGZvbnQtc2l6ZT0iMTAiIGZpbGw9InZhcigtLW11dGVkKSI+NTAlPC90ZXh0PgogICAgPHRleHQgeD0iNjQwIiB5PSIyMjIiIHRleHQtYW5jaG9yPSJlbmQiIGZvbnQtc2l6ZT0iMTAuNSIgZmlsbD0idmFyKC0tbXV0ZWQpIj50aW1lIOKGkjwvdGV4dD4KICAgIDx0ZXh0IHg9IjE0IiB5PSIxNiIgZm9udC1zaXplPSIxMC41IiBmaWxsPSJ2YXIoLS1tdXRlZCkiPmNvbGxhdGVyYWwgcmVtYWluaW5nPC90ZXh0PgoKICAgIDwhLS0gaW4tcmFuZ2Ugc2hhZGluZyBzdHJpcHMgLS0+CiAgICA8cmVjdCB4PSIxMzAiIHk9IjIwIiB3aWR0aD0iMTcwIiBoZWlnaHQ9IjE4NCIgZmlsbD0idmFyKC0tYmFuZCkiIC8+CiAgICA8cmVjdCB4PSI0MjAiIHk9IjIwIiB3aWR0aD0iMTUwIiBoZWlnaHQ9IjE4NCIgZmlsbD0idmFyKC0tYmFuZCkiIC8+CiAgICA8dGV4dCB4PSIyMTUiIHk9IjM2IiB0ZXh0LWFuY2hvcj0ibWlkZGxlIiBmb250LXNpemU9IjEwIiBmaWxsPSJ2YXIoLS1yaXNrKSI+aW4gcmFuZ2U8L3RleHQ+CiAgICA8dGV4dCB4PSI0OTUiIHk9IjM2IiB0ZXh0LWFuY2hvcj0ibWlkZGxlIiBmb250LXNpemU9IjEwIiBmaWxsPSJ2YXIoLS1yaXNrKSI+aW4gcmFuZ2U8L3RleHQ+CiAgICA8dGV4dCB4PSIzNjAiIHk9IjM2IiB0ZXh0LWFuY2hvcj0ibWlkZGxlIiBmb250LXNpemU9IjEwIiBmaWxsPSJ2YXIoLS1zYWZlKSI+cmVjb3ZlcmVkPC90ZXh0PgoKICAgIDwhLS0gY29sbGF0ZXJhbCBzdGFpcmNhc2U6IGZsYXQgNTYtMTMwLCBzdGVwcyBkb3duIDEzMC0zMDAsIGZsYXQgMzAwLTQyMCwgc3RlcHMgNDIwLTU3MCwgZmxhdCAtLT4KICAgIDxwb2x5bGluZSBmaWxsPSJub25lIiBzdHJva2U9InZhcigtLWFjY2VudCkiIHN0cm9rZS13aWR0aD0iMi40IiBwb2ludHM9IjU2LDQ0IDEzMCw0NCAxMzAsNTIgMTU2LDUyIDE1Niw2MiAxODIsNjIgMTgyLDc0IDIwOCw3NCAyMDgsODcgMjM0LDg3IDIzNCw5OSAyNjAsOTkgMjYwLDExMCAyODYsMTEwIDI4NiwxMTkgMzAwLDExOQogICAgICAgICAgICAgIDQyMCwxMTkgNDIwLDEyOCA0NDYsMTI4IDQ0NiwxMzggNDcyLDEzOCA0NzIsMTQ5IDQ5OCwxNDkgNDk4LDE1OSA1MjQsMTU5IDUyNCwxNjggNTUwLDE2OCA1NTAsMTc1IDU3MCwxNzUgNjUwLDE3NSI+PC9wb2x5bGluZT4KICAgIDwhLS0gZGVidCBsaW5lOiBtaXJyb3JzIGRvd253YXJkIG1vcmUgc2xvd2x5IC0tPgogICAgPHBvbHlsaW5lIGZpbGw9Im5vbmUiIHN0cm9rZT0idmFyKC0tc2FmZSkiIHN0cm9rZS13aWR0aD0iMS44IiBzdHJva2UtZGFzaGFycmF5PSI1IDQiIHBvaW50cz0iNTYsMTUwIDEzMCwxNTAgMzAwLDE2OCA0MjAsMTY4IDU3MCwxODYgNjUwLDE4NiI+PC9wb2x5bGluZT4KICAgIDx0ZXh0IHg9IjY0OCIgeT0iMTY0IiB0ZXh0LWFuY2hvcj0iZW5kIiBmb250LXNpemU9IjEwIiBmaWxsPSJ2YXIoLS1hY2NlbnQpIj5jb2xsYXRlcmFsPC90ZXh0PgogICAgPHRleHQgeD0iNjQ4IiB5PSIxOTkiIHRleHQtYW5jaG9yPSJlbmQiIGZvbnQtc2l6ZT0iMTAiIGZpbGw9InZhcigtLXNhZmUpIj5kZWJ0PC90ZXh0PgoKICAgIDwhLS0gYW5ub3RhdGlvbnMgLS0+CiAgICA8dGV4dCB4PSIyMTUiIHk9IjIzOCIgdGV4dC1hbmNob3I9Im1pZGRsZSIgZm9udC1zaXplPSIxMC41IiBmaWxsPSJ2YXIoLS1tdXRlZCkiPmRlY2F5IH4xJS9taW48L3RleHQ+CiAgICA8dGV4dCB4PSIzNjAiIHk9IjIzOCIgdGV4dC1hbmNob3I9Im1pZGRsZSIgZm9udC1zaXplPSIxMC41IiBmaWxsPSJ2YXIoLS1tdXRlZCkiPnBhdXNlPC90ZXh0PgogICAgPHRleHQgeD0iNDk1IiB5PSIyMzgiIHRleHQtYW5jaG9yPSJtaWRkbGUiIGZvbnQtc2l6ZT0iMTAuNSIgZmlsbD0idmFyKC0tbXV0ZWQpIj5yZXN1bWU8L3RleHQ+CiAgPC9zdmc+" id="29" name="Picture"/>
                           <pic:cNvPicPr>
                             <a:picLocks noChangeArrowheads="1" noChangeAspect="1"/>
                           </pic:cNvPicPr>
@@ -2519,7 +2503,7 @@
                     <a:graphicData uri="http://schemas.openxmlformats.org/drawingml/2006/picture">
                       <pic:pic>
                         <pic:nvPicPr>
-                          <pic:cNvPr descr="data:image/svg+xml;base64,PHN2ZyB2aWV3Ym94PSIwIDAgNzYwIDI4MCIgcm9sZT0iaW1nIiBhcmlhLWxhYmVsPSJTeXN0ZW0gYXJjaGl0ZWN0dXJlIj4KICAgIDxkZWZzPgogICAgICA8bWFya2VyIGlkPSJhcnJBIiB2aWV3Ym94PSIwIDAgOCA4IiByZWZ4PSI3IiByZWZ5PSI0IiBtYXJrZXJ3aWR0aD0iNyIgbWFya2VyaGVpZ2h0PSI3IiBvcmllbnQ9ImF1dG8iPjxwb2x5Z29uIHBvaW50cz0iMCwwLjUgOCw0IDAsNy41IiBmaWxsPSJ2YXIoLS1tdXRlZCkiPjwvcG9seWdvbj48L21hcmtlcj4KICAgIDwvZGVmcz4KICAgIDxnIGZvbnQtc2l6ZT0iMTIiPgogICAgICA8cmVjdCB4PSIyNCIgeT0iMzAiIHdpZHRoPSIxNDAiIGhlaWdodD0iNDAiIHJ4PSIzIiBmaWxsPSJub25lIiBzdHJva2U9InZhcigtLW11dGVkKSIgLz4KICAgICAgPHRleHQgeD0iOTQiIHk9IjU1IiB0ZXh0LWFuY2hvcj0ibWlkZGxlIiBmaWxsPSJ2YXIoLS1pbmspIj5Cb3Jyb3dlcnM8L3RleHQ+CiAgICAgIDxyZWN0IHg9IjI0IiB5PSIxMTYiIHdpZHRoPSIxNDAiIGhlaWdodD0iNDAiIHJ4PSIzIiBmaWxsPSJub25lIiBzdHJva2U9InZhcigtLW11dGVkKSIgLz4KICAgICAgPHRleHQgeD0iOTQiIHk9IjE0MSIgdGV4dC1hbmNob3I9Im1pZGRsZSIgZmlsbD0idmFyKC0taW5rKSI+S2VlcGVyczwvdGV4dD4KICAgICAgPHJlY3QgeD0iMjQiIHk9IjIwMiIgd2lkdGg9IjE0MCIgaGVpZ2h0PSI0MCIgcng9IjMiIGZpbGw9Im5vbmUiIHN0cm9rZT0idmFyKC0tbXV0ZWQpIiAvPgogICAgICA8dGV4dCB4PSI5NCIgeT0iMjI3IiB0ZXh0LWFuY2hvcj0ibWlkZGxlIiBmaWxsPSJ2YXIoLS1pbmspIj5Td2FwcGVyczwvdGV4dD4KICAgICAgPHJlY3QgeD0iNjAwIiB5PSIzMCIgd2lkdGg9IjE0MCIgaGVpZ2h0PSI0MCIgcng9IjMiIGZpbGw9Im5vbmUiIHN0cm9rZT0idmFyKC0tbXV0ZWQpIiAvPgogICAgICA8dGV4dCB4PSI2NzAiIHk9IjU1IiB0ZXh0LWFuY2hvcj0ibWlkZGxlIiBmaWxsPSJ2YXIoLS1pbmspIj5MZW5kZXJzPC90ZXh0PgogICAgPC9nPgoKICAgIDxyZWN0IHg9IjI1MiIgeT0iNzIiIHdpZHRoPSIyMjAiIGhlaWdodD0iMTMwIiByeD0iNCIgZmlsbD0ibm9uZSIgc3Ryb2tlPSJ2YXIoLS1hY2NlbnQpIiBzdHJva2Utd2lkdGg9IjIiIC8+CiAgICA8dGV4dCB4PSIzNjIiIHk9IjEwMiIgdGV4dC1hbmNob3I9Im1pZGRsZSIgZm9udC1zaXplPSIxNCIgZm9udC13ZWlnaHQ9IjcwMCIgZmlsbD0idmFyKC0tYWNjZW50KSI+VHJ1ZUxlbmRIb29rPC90ZXh0PgogICAgPHRleHQgeD0iMzYyIiB5PSIxMjYiIHRleHQtYW5jaG9yPSJtaWRkbGUiIGZvbnQtc2l6ZT0iMTEiIGZpbGw9InZhcigtLW11dGVkKSI+cG9zaXRpb25zIMK3IGNodW5rIGVuZ2luZTwvdGV4dD4KICAgIDx0ZXh0IHg9IjM2MiIgeT0iMTQ0IiB0ZXh0LWFuY2hvcj0ibWlkZGxlIiBmb250LXNpemU9IjExIiBmaWxsPSJ2YXIoLS1tdXRlZCkiPmludGVybmFsIG9yYWNsZSDCtyBiYWNrc3RvcHM8L3RleHQ+CiAgICA8dGV4dCB4PSIzNjIiIHk9IjE2MiIgdGV4dC1hbmNob3I9Im1pZGRsZSIgZm9udC1zaXplPSIxMSIgZmlsbD0idmFyKC0tbXV0ZWQpIj50cmlnZ2VyIGJpdG1hcCDCtyBxdWV1ZTwvdGV4dD4KICAgIDx0ZXh0IHg9IjM2MiIgeT0iMTg4IiB0ZXh0LWFuY2hvcj0ibWlkZGxlIiBmb250LXNpemU9IjEwLjUiIGZpbGw9InZhcigtLW11dGVkKSI+YWZ0ZXJJbml0aWFsaXplIMK3IGJlZm9yZVN3YXAgwrcgYWZ0ZXJTd2FwPC90ZXh0PgoKICAgIDxyZWN0IHg9IjU0MCIgeT0iOTYiIHdpZHRoPSIyMDAiIGhlaWdodD0iNDIiIHJ4PSIzIiBmaWxsPSJub25lIiBzdHJva2U9InZhcigtLXNhZmUpIiBzdHJva2Utd2lkdGg9IjEuNiIgLz4KICAgIDx0ZXh0IHg9IjY0MCIgeT0iMTIyIiB0ZXh0LWFuY2hvcj0ibWlkZGxlIiBmb250LXNpemU9IjEyIiBmaWxsPSJ2YXIoLS1zYWZlKSI+VmF1bHQgwrcgY3VycmVuY3kwPC90ZXh0PgogICAgPHJlY3QgeD0iNTQwIiB5PSIxNTIiIHdpZHRoPSIyMDAiIGhlaWdodD0iNDIiIHJ4PSIzIiBmaWxsPSJub25lIiBzdHJva2U9InZhcigtLXNhZmUpIiBzdHJva2Utd2lkdGg9IjEuNiIgLz4KICAgIDx0ZXh0IHg9IjY0MCIgeT0iMTc4IiB0ZXh0LWFuY2hvcj0ibWlkZGxlIiBmb250LXNpemU9IjEyIiBmaWxsPSJ2YXIoLS1zYWZlKSI+VmF1bHQgwrcgY3VycmVuY3kxPC90ZXh0PgoKICAgIDxyZWN0IHg9IjI1MiIgeT0iMjI4IiB3aWR0aD0iMjIwIiBoZWlnaHQ9IjQwIiByeD0iMyIgZmlsbD0ibm9uZSIgc3Ryb2tlPSJ2YXIoLS1pbmspIiBzdHJva2Utd2lkdGg9IjEuNiIgLz4KICAgIDx0ZXh0IHg9IjM2MiIgeT0iMjUzIiB0ZXh0LWFuY2hvcj0ibWlkZGxlIiBmb250LXNpemU9IjEyIiBmaWxsPSJ2YXIoLS1pbmspIj5Vbmlzd2FwIHY0IFBvb2xNYW5hZ2VyPC90ZXh0PgoKICAgIDxnIHN0cm9rZT0idmFyKC0tbXV0ZWQpIiBzdHJva2Utd2lkdGg9IjEuMiIgZmlsbD0ibm9uZSI+CiAgICAgIDxsaW5lIHgxPSIxNjQiIHkxPSI1MCIgeDI9IjI1MiIgeTI9IjkyIiBtYXJrZXItZW5kPSJ1cmwoI2FyckEpIj48L2xpbmU+CiAgICAgIDxsaW5lIHgxPSIxNjQiIHkxPSIxMzYiIHgyPSIyNTIiIHkyPSIxMzYiIG1hcmtlci1lbmQ9InVybCgjYXJyQSkiPjwvbGluZT4KICAgICAgPGxpbmUgeDE9IjE2NCIgeTE9IjIyMiIgeDI9IjI1MiIgeTI9IjI0OCIgbWFya2VyLWVuZD0idXJsKCNhcnJBKSI+PC9saW5lPgogICAgICA8bGluZSB4MT0iNDcyIiB5MT0iMTE3IiB4Mj0iNTQwIiB5Mj0iMTE3IiBtYXJrZXItZW5kPSJ1cmwoI2FyckEpIj48L2xpbmU+CiAgICAgIDxsaW5lIHgxPSI0NzIiIHkxPSIxNzMiIHgyPSI1NDAiIHkyPSIxNzMiIG1hcmtlci1lbmQ9InVybCgjYXJyQSkiPjwvbGluZT4KICAgICAgPGxpbmUgeDE9IjY3MCIgeTE9IjcwIiB4Mj0iNjU1IiB5Mj0iOTYiIG1hcmtlci1lbmQ9InVybCgjYXJyQSkiPjwvbGluZT4KICAgICAgPGxpbmUgeDE9IjM2MiIgeTE9IjIwMiIgeDI9IjM2MiIgeTI9IjIyOCIgbWFya2VyLWVuZD0idXJsKCNhcnJBKSI+PC9saW5lPgogICAgPC9nPgogICAgPGcgZm9udC1zaXplPSIxMC41IiBmaWxsPSJ2YXIoLS1tdXRlZCkiPgogICAgICA8dGV4dCB4PSIxODIiIHk9IjM2IiB0ZXh0LWFuY2hvcj0ibWlkZGxlIj5vcGVuIMK3IHJlcGF5PC90ZXh0PgogICAgICA8dGV4dCB4PSIyMDgiIHk9IjExMiIgdGV4dC1hbmNob3I9Im1pZGRsZSI+cG9rZSDCtyBmb3JjZUNsb3NlPC90ZXh0PgogICAgICA8dGV4dCB4PSIxODIiIHk9IjI3MCIgdGV4dC1hbmNob3I9Im1pZGRsZSI+c3dhcHM8L3RleHQ+CiAgICAgIDx0ZXh0IHg9IjUwNiIgeT0iMTA5IiB0ZXh0LWFuY2hvcj0ibWlkZGxlIj5ib3Jyb3c8L3RleHQ+CiAgICAgIDx0ZXh0IHg9IjUwNiIgeT0iMTY1IiB0ZXh0LWFuY2hvcj0ibWlkZGxlIj5yZXBheTwvdGV4dD4KICAgICAgPHRleHQgeD0iNzAwIiB5PSI4NiIgdGV4dC1hbmNob3I9Im1pZGRsZSI+ZGVwb3NpdDwvdGV4dD4KICAgICAgPHRleHQgeD0iMzcyIiB5PSIyMTgiIHRleHQtYW5jaG9yPSJzdGFydCI+Y2h1bmsgc3dhcHMgwrcgZG9uYXRlPC90ZXh0PgogICAgPC9nPgogIDwvc3ZnPg==" id="36" name="Picture"/>
+                          <pic:cNvPr descr="data:image/svg+xml;base64,PHN2ZyB2aWV3Ym94PSIwIDAgNzYwIDI4MCIgcm9sZT0iaW1nIiBhcmlhLWxhYmVsPSJTeXN0ZW0gYXJjaGl0ZWN0dXJlIj4KICAgIDxkZWZzPgogICAgICA8bWFya2VyIGlkPSJhcnJBIiB2aWV3Ym94PSIwIDAgOCA4IiByZWZ4PSI3IiByZWZ5PSI0IiBtYXJrZXJ3aWR0aD0iNyIgbWFya2VyaGVpZ2h0PSI3IiBvcmllbnQ9ImF1dG8iPjxwb2x5Z29uIHBvaW50cz0iMCwwLjUgOCw0IDAsNy41IiBmaWxsPSJ2YXIoLS1tdXRlZCkiPjwvcG9seWdvbj48L21hcmtlcj4KICAgIDwvZGVmcz4KICAgIDxnIGZvbnQtc2l6ZT0iMTIiPgogICAgICA8cmVjdCB4PSIyNCIgeT0iMzAiIHdpZHRoPSIxNDAiIGhlaWdodD0iNDAiIHJ4PSIzIiBmaWxsPSJub25lIiBzdHJva2U9InZhcigtLW11dGVkKSIgLz4KICAgICAgPHRleHQgeD0iOTQiIHk9IjU1IiB0ZXh0LWFuY2hvcj0ibWlkZGxlIiBmaWxsPSJ2YXIoLS1pbmspIj5Cb3Jyb3dlcnM8L3RleHQ+CiAgICAgIDxyZWN0IHg9IjI0IiB5PSIxMTYiIHdpZHRoPSIxNDAiIGhlaWdodD0iNDAiIHJ4PSIzIiBmaWxsPSJub25lIiBzdHJva2U9InZhcigtLW11dGVkKSIgLz4KICAgICAgPHRleHQgeD0iOTQiIHk9IjE0MSIgdGV4dC1hbmNob3I9Im1pZGRsZSIgZmlsbD0idmFyKC0taW5rKSI+S2VlcGVyczwvdGV4dD4KICAgICAgPHJlY3QgeD0iMjQiIHk9IjIwMiIgd2lkdGg9IjE0MCIgaGVpZ2h0PSI0MCIgcng9IjMiIGZpbGw9Im5vbmUiIHN0cm9rZT0idmFyKC0tbXV0ZWQpIiAvPgogICAgICA8dGV4dCB4PSI5NCIgeT0iMjI3IiB0ZXh0LWFuY2hvcj0ibWlkZGxlIiBmaWxsPSJ2YXIoLS1pbmspIj5Td2FwcGVyczwvdGV4dD4KICAgICAgPHJlY3QgeD0iNjAwIiB5PSIzMCIgd2lkdGg9IjE0MCIgaGVpZ2h0PSI0MCIgcng9IjMiIGZpbGw9Im5vbmUiIHN0cm9rZT0idmFyKC0tbXV0ZWQpIiAvPgogICAgICA8dGV4dCB4PSI2NzAiIHk9IjU1IiB0ZXh0LWFuY2hvcj0ibWlkZGxlIiBmaWxsPSJ2YXIoLS1pbmspIj5MZW5kZXJzPC90ZXh0PgogICAgPC9nPgoKICAgIDxyZWN0IHg9IjI1MiIgeT0iNzIiIHdpZHRoPSIyMjAiIGhlaWdodD0iMTMwIiByeD0iNCIgZmlsbD0ibm9uZSIgc3Ryb2tlPSJ2YXIoLS1hY2NlbnQpIiBzdHJva2Utd2lkdGg9IjIiIC8+CiAgICA8dGV4dCB4PSIzNjIiIHk9IjEwMiIgdGV4dC1hbmNob3I9Im1pZGRsZSIgZm9udC1zaXplPSIxNCIgZm9udC13ZWlnaHQ9IjcwMCIgZmlsbD0idmFyKC0tYWNjZW50KSI+VHJ1ZUxlbmRIb29rPC90ZXh0PgogICAgPHRleHQgeD0iMzYyIiB5PSIxMjYiIHRleHQtYW5jaG9yPSJtaWRkbGUiIGZvbnQtc2l6ZT0iMTEiIGZpbGw9InZhcigtLW11dGVkKSI+cG9zaXRpb25zIMK3IGNodW5rIGVuZ2luZTwvdGV4dD4KICAgIDx0ZXh0IHg9IjM2MiIgeT0iMTQ0IiB0ZXh0LWFuY2hvcj0ibWlkZGxlIiBmb250LXNpemU9IjExIiBmaWxsPSJ2YXIoLS1tdXRlZCkiPmludGVybmFsIG9yYWNsZSDCtyBiYWNrc3RvcHM8L3RleHQ+CiAgICA8dGV4dCB4PSIzNjIiIHk9IjE2MiIgdGV4dC1hbmNob3I9Im1pZGRsZSIgZm9udC1zaXplPSIxMSIgZmlsbD0idmFyKC0tbXV0ZWQpIj50cmlnZ2VyIGJpdG1hcCDCtyBxdWV1ZTwvdGV4dD4KCiAgICA8cmVjdCB4PSI1NDAiIHk9Ijk2IiB3aWR0aD0iMjAwIiBoZWlnaHQ9IjQyIiByeD0iMyIgZmlsbD0ibm9uZSIgc3Ryb2tlPSJ2YXIoLS1zYWZlKSIgc3Ryb2tlLXdpZHRoPSIxLjYiIC8+CiAgICA8dGV4dCB4PSI2NDAiIHk9IjEyMiIgdGV4dC1hbmNob3I9Im1pZGRsZSIgZm9udC1zaXplPSIxMiIgZmlsbD0idmFyKC0tc2FmZSkiPlZhdWx0IMK3IGN1cnJlbmN5MDwvdGV4dD4KICAgIDxyZWN0IHg9IjU0MCIgeT0iMTUyIiB3aWR0aD0iMjAwIiBoZWlnaHQ9IjQyIiByeD0iMyIgZmlsbD0ibm9uZSIgc3Ryb2tlPSJ2YXIoLS1zYWZlKSIgc3Ryb2tlLXdpZHRoPSIxLjYiIC8+CiAgICA8dGV4dCB4PSI2NDAiIHk9IjE3OCIgdGV4dC1hbmNob3I9Im1pZGRsZSIgZm9udC1zaXplPSIxMiIgZmlsbD0idmFyKC0tc2FmZSkiPlZhdWx0IMK3IGN1cnJlbmN5MTwvdGV4dD4KCiAgICA8cmVjdCB4PSIyNTIiIHk9IjIyOCIgd2lkdGg9IjIyMCIgaGVpZ2h0PSI0MCIgcng9IjMiIGZpbGw9Im5vbmUiIHN0cm9rZT0idmFyKC0taW5rKSIgc3Ryb2tlLXdpZHRoPSIxLjYiIC8+CiAgICA8dGV4dCB4PSIzNjIiIHk9IjI1MyIgdGV4dC1hbmNob3I9Im1pZGRsZSIgZm9udC1zaXplPSIxMiIgZmlsbD0idmFyKC0taW5rKSI+VW5pc3dhcCB2NCBQb29sTWFuYWdlcjwvdGV4dD4KCiAgICA8ZyBzdHJva2U9InZhcigtLW11dGVkKSIgc3Ryb2tlLXdpZHRoPSIxLjIiIGZpbGw9Im5vbmUiPgogICAgICA8bGluZSB4MT0iMTY0IiB5MT0iNTAiIHgyPSIyNTIiIHkyPSI5MiIgbWFya2VyLWVuZD0idXJsKCNhcnJBKSI+PC9saW5lPgogICAgICA8bGluZSB4MT0iMTY0IiB5MT0iMTM2IiB4Mj0iMjUyIiB5Mj0iMTM2IiBtYXJrZXItZW5kPSJ1cmwoI2FyckEpIj48L2xpbmU+CiAgICAgIDxsaW5lIHgxPSIxNjQiIHkxPSIyMjIiIHgyPSIyNTIiIHkyPSIyNDgiIG1hcmtlci1lbmQ9InVybCgjYXJyQSkiPjwvbGluZT4KICAgICAgPGxpbmUgeDE9IjQ3MiIgeTE9IjExNyIgeDI9IjU0MCIgeTI9IjExNyIgbWFya2VyLWVuZD0idXJsKCNhcnJBKSI+PC9saW5lPgogICAgICA8bGluZSB4MT0iNDcyIiB5MT0iMTczIiB4Mj0iNTQwIiB5Mj0iMTczIiBtYXJrZXItZW5kPSJ1cmwoI2FyckEpIj48L2xpbmU+CiAgICAgIDxsaW5lIHgxPSI2NzAiIHkxPSI3MCIgeDI9IjY1NSIgeTI9Ijk2IiBtYXJrZXItZW5kPSJ1cmwoI2FyckEpIj48L2xpbmU+CiAgICAgIDxsaW5lIHgxPSIzNjIiIHkxPSIyMDIiIHgyPSIzNjIiIHkyPSIyMjgiIG1hcmtlci1lbmQ9InVybCgjYXJyQSkiPjwvbGluZT4KICAgIDwvZz4KICAgIDxnIGZvbnQtc2l6ZT0iMTAuNSIgZmlsbD0idmFyKC0tbXV0ZWQpIj4KICAgICAgPHRleHQgeD0iMjA4IiB5PSI2MCIgdGV4dC1hbmNob3I9Im1pZGRsZSI+b3BlbiDCtyByZXBheTwvdGV4dD4KICAgICAgPHRleHQgeD0iMjA4IiB5PSIxMTgiIHRleHQtYW5jaG9yPSJtaWRkbGUiPnBva2Ugwrc8L3RleHQ+CiAgICAgIDx0ZXh0IHg9IjIwOCIgeT0iMTMxIiB0ZXh0LWFuY2hvcj0ibWlkZGxlIj5mb3JjZUNsb3NlPC90ZXh0PgogICAgICA8dGV4dCB4PSIyMDAiIHk9IjIxNCIgdGV4dC1hbmNob3I9Im1pZGRsZSI+c3dhcHM8L3RleHQ+CiAgICAgIDx0ZXh0IHg9IjUwNiIgeT0iMTA5IiB0ZXh0LWFuY2hvcj0ibWlkZGxlIj5ib3Jyb3c8L3RleHQ+CiAgICAgIDx0ZXh0IHg9IjUwNiIgeT0iMTY1IiB0ZXh0LWFuY2hvcj0ibWlkZGxlIj5yZXBheTwvdGV4dD4KICAgICAgPHRleHQgeD0iNzAwIiB5PSI4NiIgdGV4dC1hbmNob3I9Im1pZGRsZSI+ZGVwb3NpdDwvdGV4dD4KICAgICAgPHRleHQgeD0iMzcyIiB5PSIyMjIiIHRleHQtYW5jaG9yPSJzdGFydCI+Y2h1bmsgc3dhcHMgwrcgZG9uYXRlPC90ZXh0PgogICAgPC9nPgogIDwvc3ZnPg==" id="36" name="Picture"/>
                           <pic:cNvPicPr>
                             <a:picLocks noChangeArrowheads="1" noChangeAspect="1"/>
                           </pic:cNvPicPr>
@@ -2790,6 +2774,14 @@
         <w:pStyle w:val="FirstParagraph"/>
       </w:pPr>
       <w:r>
+        <w:t xml:space="preserve">Three further gates apply at opening: a minimum distance between the filtered price and the range start, a minimum position size, and the 95%-of-LT headroom on opening LTV.</w:t>
+      </w:r>
+    </w:p>
+    <w:p>
+      <w:pPr>
+        <w:pStyle w:val="BodyText"/>
+      </w:pPr>
+      <w:r>
         <w:t xml:space="preserve">An attacker who pumps spot changes nothing about their borrowing power. An attacker who shoves the price into a victim's range merely starts a rate-limited, pausable, penalty-paying decay and hands two-way fees to LPs — an attack with negative expected value.</w:t>
       </w:r>
     </w:p>
@@ -2991,7 +2983,7 @@
                     <a:graphicData uri="http://schemas.openxmlformats.org/drawingml/2006/picture">
                       <pic:pic>
                         <pic:nvPicPr>
-                          <pic:cNvPr descr="data:image/svg+xml;base64,PHN2ZyB2aWV3Ym94PSIwIDAgNjgwIDI5MCIgcm9sZT0iaW1nIiBhcmlhLWxhYmVsPSJGaXZlIHN0YWNrZWQgc29sdmVuY3kgbGF5ZXJzLCBlYWNoIGNhdGNoaW5nIHdoYXQgdGhlIHByZXZpb3VzIGxldHMgdGhyb3VnaCI+CiAgICA8ZGVmcz4KICAgICAgPG1hcmtlciBpZD0iYXJyTCIgdmlld2JveD0iMCAwIDggOCIgcmVmeD0iNyIgcmVmeT0iNCIgbWFya2Vyd2lkdGg9IjciIG1hcmtlcmhlaWdodD0iNyIgb3JpZW50PSJhdXRvIj48cG9seWdvbiBwb2ludHM9IjAsMC41IDgsNCAwLDcuNSIgZmlsbD0idmFyKC0tbXV0ZWQpIj48L3BvbHlnb24+PC9tYXJrZXI+CiAgICA8L2RlZnM+CiAgICA8ZyBmb250LXNpemU9IjEwLjUiPgogICAgICA8cmVjdCB4PSI0MCIgeT0iMTYiIHdpZHRoPSI2MDAiIGhlaWdodD0iNDAiIHJ4PSIzIiBmaWxsPSJ2YXIoLS1zYWZlYmFuZCkiIHN0cm9rZT0idmFyKC0tc2FmZSkiIC8+CiAgICAgIDx0ZXh0IHg9IjU4IiB5PSIzMyIgZm9udC13ZWlnaHQ9IjcwMCIgZmlsbD0idmFyKC0taW5rKSI+MSDCtyBPUklHSU5BVElPTiBHQVRFUzwvdGV4dD4KICAgICAgPHRleHQgeD0iNTgiIHk9IjQ3IiBmaWxsPSJ2YXIoLS1tdXRlZCkiPndvcnNlLW9mIHByaWNpbmcgwrcgTFRWIOKJpCA5NSUgb2YgTFQgwrcgbWluIGdhcCDCtyBib290c3RyYXAgwrcgdXRpbGl6YXRpb24gY2FwPC90ZXh0PgoKICAgICAgPHJlY3QgeD0iNzAiIHk9IjcyIiB3aWR0aD0iNTQwIiBoZWlnaHQ9IjQwIiByeD0iMyIgZmlsbD0idmFyKC0tc2FmZWJhbmQpIiBzdHJva2U9InZhcigtLXNhZmUpIiAvPgogICAgICA8dGV4dCB4PSI4OCIgeT0iODkiIGZvbnQtd2VpZ2h0PSI3MDAiIGZpbGw9InZhcigtLWluaykiPjIgwrcgSU4tUkFOR0UgREVMRVZFUkFHSU5HPC90ZXh0PgogICAgICA8dGV4dCB4PSI4OCIgeT0iMTAzIiBmaWxsPSJ2YXIoLS1tdXRlZCkiPmV2ZXJ5IGNodW5rIHJlZHVjZXMgZGVidCDigJQgZGVjYXkgbWFrZXMgcG9zaXRpb25zIGhlYWx0aGllcjwvdGV4dD4KCiAgICAgIDxyZWN0IHg9IjEwMCIgeT0iMTI4IiB3aWR0aD0iNDgwIiBoZWlnaHQ9IjQwIiByeD0iMyIgZmlsbD0idmFyKC0tYmFuZCkiIHN0cm9rZT0idmFyKC0tcmlzaykiIC8+CiAgICAgIDx0ZXh0IHg9IjExOCIgeT0iMTQ1IiBmb250LXdlaWdodD0iNzAwIiBmaWxsPSJ2YXIoLS1pbmspIj4zIMK3IEhFQUxUSCBCQUNLU1RPUDwvdGV4dD4KICAgICAgPHRleHQgeD0iMTE4IiB5PSIxNTkiIGZpbGw9InZhcigtLW11dGVkKSI+Y29sbGF0ZXJhbCBhdCBjdXJyZW50IHByaWNlIHN0b3BzIGNvdmVyaW5nIGRlYnQg4oaSIGFueW9uZSBjbG9zZXMsIHNsaXBwYWdlLWJvdW5kZWQ8L3RleHQ+CgogICAgICA8cmVjdCB4PSIxMzAiIHk9IjE4NCIgd2lkdGg9IjQyMCIgaGVpZ2h0PSI0MCIgcng9IjMiIGZpbGw9InZhcigtLWJhbmQpIiBzdHJva2U9InZhcigtLXJpc2spIiAvPgogICAgICA8dGV4dCB4PSIxNDgiIHk9IjIwMSIgZm9udC13ZWlnaHQ9IjcwMCIgZmlsbD0idmFyKC0taW5rKSI+NCDCtyBSQU5HRSBFWEhBVVNUSU9OIC8gRVhQSVJZPC90ZXh0PgogICAgICA8dGV4dCB4PSIxNDgiIHk9IjIxNSIgZmlsbD0idmFyKC0tbXV0ZWQpIj5wcmljZSBvdXRyYW4gdGhlIHBhY2luZywgb3IgdGhlIHRlcm0gZW5kZWQg4oaSIGNsb3NlIG5vdzwvdGV4dD4KCiAgICAgIDxyZWN0IHg9IjE2MCIgeT0iMjQwIiB3aWR0aD0iMzYwIiBoZWlnaHQ9IjQwIiByeD0iMyIgZmlsbD0idmFyKC0tYmFuZC1zdHJvbmcpIiBzdHJva2U9InZhcigtLXJpc2spIiBzdHJva2Utd2lkdGg9IjEuNiIgLz4KICAgICAgPHRleHQgeD0iMTc4IiB5PSIyNTciIGZvbnQtd2VpZ2h0PSI3MDAiIGZpbGw9InZhcigtLWluaykiPjUgwrcgREVDTEFSRUQgV0FURVJGQUxMPC90ZXh0PgogICAgICA8dGV4dCB4PSIxNzgiIHk9IjI3MSIgZmlsbD0idmFyKC0tbXV0ZWQpIj5yZXNlcnZlcyDihpIgcHJvLXJhdGEgbGVuZGVyIGhhaXJjdXQgwrcgcmVjb3JkZWQgb24tY2hhaW48L3RleHQ+CiAgICA8L2c+CiAgICA8ZyBzdHJva2U9InZhcigtLW11dGVkKSIgc3Ryb2tlLXdpZHRoPSIxLjEiPgogICAgICA8bGluZSB4MT0iMzQwIiB5MT0iNTYiIHgyPSIzNDAiIHkyPSI3MiIgbWFya2VyLWVuZD0idXJsKCNhcnJMKSI+PC9saW5lPgogICAgICA8bGluZSB4MT0iMzQwIiB5MT0iMTEyIiB4Mj0iMzQwIiB5Mj0iMTI4IiBtYXJrZXItZW5kPSJ1cmwoI2FyckwpIj48L2xpbmU+CiAgICAgIDxsaW5lIHgxPSIzNDAiIHkxPSIxNjgiIHgyPSIzNDAiIHkyPSIxODQiIG1hcmtlci1lbmQ9InVybCgjYXJyTCkiPjwvbGluZT4KICAgICAgPGxpbmUgeDE9IjM0MCIgeTE9IjIyNCIgeDI9IjM0MCIgeTI9IjI0MCIgbWFya2VyLWVuZD0idXJsKCNhcnJMKSI+PC9saW5lPgogICAgPC9nPgogIDwvc3ZnPg==" id="43" name="Picture"/>
+                          <pic:cNvPr descr="data:image/svg+xml;base64,PHN2ZyB2aWV3Ym94PSIwIDAgNjgwIDI5MCIgcm9sZT0iaW1nIiBhcmlhLWxhYmVsPSJGaXZlIHN0YWNrZWQgc29sdmVuY3kgbGF5ZXJzLCBlYWNoIGNhdGNoaW5nIHdoYXQgdGhlIHByZXZpb3VzIGxldHMgdGhyb3VnaCI+CiAgICA8ZGVmcz4KICAgICAgPG1hcmtlciBpZD0iYXJyTCIgdmlld2JveD0iMCAwIDggOCIgcmVmeD0iNyIgcmVmeT0iNCIgbWFya2Vyd2lkdGg9IjciIG1hcmtlcmhlaWdodD0iNyIgb3JpZW50PSJhdXRvIj48cG9seWdvbiBwb2ludHM9IjAsMC41IDgsNCAwLDcuNSIgZmlsbD0idmFyKC0tbXV0ZWQpIj48L3BvbHlnb24+PC9tYXJrZXI+CiAgICA8L2RlZnM+CiAgICA8ZyBmb250LXNpemU9IjEwLjUiPgogICAgICA8cmVjdCB4PSI0MCIgeT0iMTYiIHdpZHRoPSI2MDAiIGhlaWdodD0iNDAiIHJ4PSIzIiBmaWxsPSJ2YXIoLS1zYWZlYmFuZCkiIHN0cm9rZT0idmFyKC0tc2FmZSkiIC8+CiAgICAgIDx0ZXh0IHg9IjU4IiB5PSIzMyIgZm9udC13ZWlnaHQ9IjcwMCIgZmlsbD0idmFyKC0taW5rKSI+MSDCtyBPUklHSU5BVElPTiBHQVRFUzwvdGV4dD4KICAgICAgPHRleHQgeD0iNTgiIHk9IjQ3IiBmb250LXNpemU9IjEwIiBmaWxsPSJ2YXIoLS1tdXRlZCkiPndvcnNlLW9mIHByaWNpbmcgwrcgTFRWIOKJpCA5NSUgb2YgTFQgwrcgbWluIGdhcCDCtyBib290c3RyYXAgwrcgdXRpbGl6YXRpb24gY2FwPC90ZXh0PgoKICAgICAgPHJlY3QgeD0iNzAiIHk9IjcyIiB3aWR0aD0iNTQwIiBoZWlnaHQ9IjQwIiByeD0iMyIgZmlsbD0idmFyKC0tc2FmZWJhbmQpIiBzdHJva2U9InZhcigtLXNhZmUpIiAvPgogICAgICA8dGV4dCB4PSI4OCIgeT0iODkiIGZvbnQtd2VpZ2h0PSI3MDAiIGZpbGw9InZhcigtLWluaykiPjIgwrcgSU4tUkFOR0UgREVMRVZFUkFHSU5HPC90ZXh0PgogICAgICA8dGV4dCB4PSI4OCIgeT0iMTAzIiBmb250LXNpemU9IjEwIiBmaWxsPSJ2YXIoLS1tdXRlZCkiPmV2ZXJ5IGNodW5rIHJlZHVjZXMgZGVidCDigJQgZGVjYXkgbWFrZXMgcG9zaXRpb25zIGhlYWx0aGllcjwvdGV4dD4KCiAgICAgIDxyZWN0IHg9IjEwMCIgeT0iMTI4IiB3aWR0aD0iNDgwIiBoZWlnaHQ9IjQwIiByeD0iMyIgZmlsbD0idmFyKC0tYmFuZCkiIHN0cm9rZT0idmFyKC0tcmlzaykiIC8+CiAgICAgIDx0ZXh0IHg9IjExOCIgeT0iMTQ1IiBmb250LXdlaWdodD0iNzAwIiBmaWxsPSJ2YXIoLS1pbmspIj4zIMK3IEhFQUxUSCBCQUNLU1RPUDwvdGV4dD4KICAgICAgPHRleHQgeD0iMTE4IiB5PSIxNTkiIGZvbnQtc2l6ZT0iMTAiIGZpbGw9InZhcigtLW11dGVkKSI+Y29sbGF0ZXJhbCBubyBsb25nZXIgY292ZXJzIGRlYnQgYXQgY3VycmVudCBwcmljZSDihpIgcGVybWlzc2lvbmxlc3MgY2xvc2U8L3RleHQ+CgogICAgICA8cmVjdCB4PSIxMzAiIHk9IjE4NCIgd2lkdGg9IjQyMCIgaGVpZ2h0PSI0MCIgcng9IjMiIGZpbGw9InZhcigtLWJhbmQpIiBzdHJva2U9InZhcigtLXJpc2spIiAvPgogICAgICA8dGV4dCB4PSIxNDgiIHk9IjIwMSIgZm9udC13ZWlnaHQ9IjcwMCIgZmlsbD0idmFyKC0taW5rKSI+NCDCtyBSQU5HRSBFWEhBVVNUSU9OIC8gRVhQSVJZPC90ZXh0PgogICAgICA8dGV4dCB4PSIxNDgiIHk9IjIxNSIgZm9udC1zaXplPSIxMCIgZmlsbD0idmFyKC0tbXV0ZWQpIj5wcmljZSBvdXRyYW4gdGhlIHBhY2luZywgb3IgdGhlIHRlcm0gZW5kZWQg4oaSIGNsb3NlIG5vdzwvdGV4dD4KCiAgICAgIDxyZWN0IHg9IjE2MCIgeT0iMjQwIiB3aWR0aD0iMzYwIiBoZWlnaHQ9IjQwIiByeD0iMyIgZmlsbD0idmFyKC0tYmFuZC1zdHJvbmcpIiBzdHJva2U9InZhcigtLXJpc2spIiBzdHJva2Utd2lkdGg9IjEuNiIgLz4KICAgICAgPHRleHQgeD0iMTc4IiB5PSIyNTciIGZvbnQtd2VpZ2h0PSI3MDAiIGZpbGw9InZhcigtLWluaykiPjUgwrcgREVDTEFSRUQgV0FURVJGQUxMPC90ZXh0PgogICAgICA8dGV4dCB4PSIxNzgiIHk9IjI3MSIgZm9udC1zaXplPSIxMCIgZmlsbD0idmFyKC0tbXV0ZWQpIj5yZXNlcnZlcywgdGhlbiBwcm8tcmF0YSBsZW5kZXIgaGFpcmN1dCDigJQgb24tY2hhaW4gcmVjb3JkPC90ZXh0PgogICAgPC9nPgogICAgPGcgc3Ryb2tlPSJ2YXIoLS1tdXRlZCkiIHN0cm9rZS13aWR0aD0iMS4xIj4KICAgICAgPGxpbmUgeDE9IjM0MCIgeTE9IjU2IiB4Mj0iMzQwIiB5Mj0iNzIiIG1hcmtlci1lbmQ9InVybCgjYXJyTCkiPjwvbGluZT4KICAgICAgPGxpbmUgeDE9IjM0MCIgeTE9IjExMiIgeDI9IjM0MCIgeTI9IjEyOCIgbWFya2VyLWVuZD0idXJsKCNhcnJMKSI+PC9saW5lPgogICAgICA8bGluZSB4MT0iMzQwIiB5MT0iMTY4IiB4Mj0iMzQwIiB5Mj0iMTg0IiBtYXJrZXItZW5kPSJ1cmwoI2FyckwpIj48L2xpbmU+CiAgICAgIDxsaW5lIHgxPSIzNDAiIHkxPSIyMjQiIHgyPSIzNDAiIHkyPSIyNDAiIG1hcmtlci1lbmQ9InVybCgjYXJyTCkiPjwvbGluZT4KICAgIDwvZz4KICA8L3N2Zz4=" id="43" name="Picture"/>
                           <pic:cNvPicPr>
                             <a:picLocks noChangeArrowheads="1" noChangeAspect="1"/>
                           </pic:cNvPicPr>
@@ -3851,9 +3843,11 @@
       <w:r>
         <w:t xml:space="preserve">proposed the passive oracle-free version; the required negative-liquidity primitive does not exist in v4 and the design was never built — TrueLend's chunk engine is its only sound realization.</w:t>
       </w:r>
-      <w:r>
-        <w:t xml:space="preserve"> </w:t>
-      </w:r>
+    </w:p>
+    <w:p>
+      <w:pPr>
+        <w:pStyle w:val="BodyText"/>
+      </w:pPr>
       <w:r>
         <w:rPr>
           <w:b/>
@@ -3912,9 +3906,11 @@
       <w:r>
         <w:t xml:space="preserve">denominates debt and collateral in swap-invariant units, eliminating price from solvency where positions are naturally balanced — inapplicable to token-vs-token debt, but its spirit survives in TrueLend's price-free liquidation trigger.</w:t>
       </w:r>
-      <w:r>
-        <w:t xml:space="preserve"> </w:t>
-      </w:r>
+    </w:p>
+    <w:p>
+      <w:pPr>
+        <w:pStyle w:val="BodyText"/>
+      </w:pPr>
       <w:r>
         <w:rPr>
           <w:b/>

</xml_diff>

<commit_message>
Docs: native-ETH exclusion is a scope choice, not a v4 limitation
v4 supports native ETH as currency0 (verified against v4-core); the hook
declines native pools because lending flows use ERC-20 pull semantics and
WETH pairs serve the same market. Wording corrected in WHITEPAPER/DESIGN
and regenerated formats.
</commit_message>
<xml_diff>
--- a/docs/TrueLend-Whitepaper.docx
+++ b/docs/TrueLend-Whitepaper.docx
@@ -3546,7 +3546,47 @@
         <w:t xml:space="preserve"> </w:t>
       </w:r>
       <w:r>
-        <w:t xml:space="preserve">Standard ERC-20 pairs only — no fee-on-transfer, rebasing, or transfer-hook tokens; no native-ETH pools (rejected at initialization); chains with transient storage (Cancun+).</w:t>
+        <w:t xml:space="preserve">Standard ERC-20 pairs only — no fee-on-transfer, rebasing, or transfer-hook tokens. Native-ETH pools are declined at initialization</w:t>
+      </w:r>
+      <w:r>
+        <w:t xml:space="preserve"> </w:t>
+      </w:r>
+      <w:r>
+        <w:rPr>
+          <w:i/>
+          <w:iCs/>
+        </w:rPr>
+        <w:t xml:space="preserve">by choice, not necessity</w:t>
+      </w:r>
+      <w:r>
+        <w:t xml:space="preserve">: v4 supports native ETH as</w:t>
+      </w:r>
+      <w:r>
+        <w:t xml:space="preserve"> </w:t>
+      </w:r>
+      <w:r>
+        <w:rPr>
+          <w:rStyle w:val="VerbatimChar"/>
+        </w:rPr>
+        <w:t xml:space="preserve">currency0</w:t>
+      </w:r>
+      <w:r>
+        <w:t xml:space="preserve">, but the lending flows are built on ERC-20 pull semantics (vault deposits,</w:t>
+      </w:r>
+      <w:r>
+        <w:t xml:space="preserve"> </w:t>
+      </w:r>
+      <w:r>
+        <w:rPr>
+          <w:rStyle w:val="VerbatimChar"/>
+        </w:rPr>
+        <w:t xml:space="preserve">transferFrom</w:t>
+      </w:r>
+      <w:r>
+        <w:t xml:space="preserve"> </w:t>
+      </w:r>
+      <w:r>
+        <w:t xml:space="preserve">on open and repay), and supporting native would add payable entry points and ETH-send reentrancy surface for no market coverage — WETH pairs serve the same asset. Native support is a deliberate deferral. Chains with transient storage (Cancun+).</w:t>
       </w:r>
     </w:p>
     <w:p>

</xml_diff>

<commit_message>
Doc consistency pass: audit status, trigger cap, validated params everywhere
- DESIGN §4.3 documents the 32-per-tick registration cap and why it exists;
  security posture now records the internal audit + setConfig validation
- WHITEPAPER §5.3 parameterization is no longer "open" — states the simulated
  tiers, the replay validation, the stable no-depeg framing, the LLAMMA anchor;
  §10 all-four-linked-libraries + native pools; §11 audit status (md + both
  HTMLs + regenerated PDF/DOCX)
- PARAMETERS §7.1 corrected to the actual 4,000 antithetic paths; κ sweep
  status noted inline
- README: LiqRangeMath role includes open-LTV + force-close eligibility
</commit_message>
<xml_diff>
--- a/docs/TrueLend-Whitepaper.docx
+++ b/docs/TrueLend-Whitepaper.docx
@@ -2616,7 +2616,7 @@
         <w:t xml:space="preserve"> </w:t>
       </w:r>
       <w:r>
-        <w:t xml:space="preserve">System architecture. One hook instance serves any number of pools; initializing an ERC-20/ERC-20 pool with the hook automatically deploys its two vaults and makes it a lending market.</w:t>
+        <w:t xml:space="preserve">System architecture. One hook instance serves any number of pools; initializing a pool with the hook — an ERC-20 pair or a native-ETH pool, the latter WETH-bridged at the hook boundary — automatically deploys its two vaults and makes it a lending market.</w:t>
       </w:r>
     </w:p>
     <w:bookmarkEnd w:id="37"/>
@@ -3307,7 +3307,19 @@
         <w:t xml:space="preserve">T</w:t>
       </w:r>
       <w:r>
-        <w:t xml:space="preserve">. Sweeping this tradeoff against historical volatility, per pool-depth tier, is the protocol's principal open parameterization exercise — analogous to LLAMMA's empirically measured soft-liquidation loss curve.</w:t>
+        <w:t xml:space="preserve">. This tradeoff has been swept per pool-depth tier (PARAMETERS.md; results in notebooks/RESULTS.md): Monte-Carlo acceptance yields LT</w:t>
+      </w:r>
+      <w:r>
+        <w:rPr>
+          <w:vertAlign w:val="subscript"/>
+        </w:rPr>
+        <w:t xml:space="preserve">max</w:t>
+      </w:r>
+      <w:r>
+        <w:t xml:space="preserve"> </w:t>
+      </w:r>
+      <w:r>
+        <w:t xml:space="preserve">of 99% (stable), 95% (major) and 88–90% (long-tail), and a historical replay of the six major crash weeks since 2021 through the same episode engine — with walk-forward re-acceptance on trailing data only — validates the major tier ex-ante and ex-post, shows stable LT 99 to be exactly a no-depeg bet (a multi-percent depeg gaps through a 1% cushion; depeg-aware sizing is ≈96.5%), and bounds long-tail listings by position size against measured book depth rather than by LT (notebooks/BACKTEST.md). Borrower cost in deep replayed episodes (73 bps median) lands on the correct side of LLAMMA's empirically measured soft-liquidation loss curve (≈100 bps).</w:t>
       </w:r>
     </w:p>
     <w:bookmarkEnd w:id="45"/>
@@ -4722,7 +4734,7 @@
         <w:t xml:space="preserve">TriggerIndex</w:t>
       </w:r>
       <w:r>
-        <w:t xml:space="preserve">. Any ERC-20/ERC-20 pool initialized with the hook becomes a lending market automatically. 86 tests: fuzzed unit tests for all math, vault accounting and waterfall tests, 28 full-lifecycle integration scenarios plus 4 native-ETH pool scenarios (including LT-99 leverage, manipulation rejection, the drained-pool backstop, and a 6-vs-18-decimals pair), and randomized invariant tests.</w:t>
+        <w:t xml:space="preserve">. Any pool initialized with the hook — ERC-20 pairs or native-ETH pools, the latter WETH-bridged at the hook boundary — becomes a lending market automatically. 86 tests: fuzzed unit tests for all math, vault accounting and waterfall tests, 28 full-lifecycle integration scenarios plus 4 native-ETH pool scenarios (including LT-99 leverage, manipulation rejection, the drained-pool backstop, and a 6-vs-18-decimals pair), and randomized invariant tests.</w:t>
       </w:r>
     </w:p>
     <w:p>
@@ -4874,7 +4886,7 @@
         <w:pStyle w:val="FirstParagraph"/>
       </w:pPr>
       <w:r>
-        <w:t xml:space="preserve">The protocol is not audited. Chunk-pacing constants, the penalty curve, and per-pool LT tiers are engineering defaults pending the volatility-sweep parameterization of §5.3. Decay liveness in fully quiescent markets depends on</w:t>
+        <w:t xml:space="preserve">The protocol has passed an internal audit (three findings — force-close reward accounting, a trigger-tick registration cap, configuration validation — fixed with regression tests) but not an external one. Chunk-pacing constants, the penalty curve, and per-pool LT tiers are set by the §5.3 parameterization, live-calibrated and validated against historical replay; the arbitrage-refill constant κ still awaits trade-level calibration. Decay liveness in fully quiescent markets depends on</w:t>
       </w:r>
       <w:r>
         <w:t xml:space="preserve"> </w:t>

</xml_diff>